<commit_message>
Bank papers: un-mirror REPORT and checklist tables, signature line spacing
- LibreOffice also mirrors tables without w:bidiVisual when they hold
  right-to-left paragraphs in a left-to-right section (REPORT, payment
  checklists). The explicit w:bidiVisual="0" is now written for every table,
  so the PDF matches Word: label on the right, its value next to it
- تقرير محضر استلام ابتدائي: the signature line wrapped «الاستشاري» to a
  second line; its padding is reduced so المالك / المقاول / الاستشاري stay
  on one line, apart
- checklist header values kept inside the page; changed templates are
  version 3 (no other template's layout changed)

Co-Authored-By: Claude Opus 5.5 <noreply@anthropic.com>
Claude-Session: https://claude.ai/code/session_01KhB95Q3CdNoHoGHNq4XQ7x
</commit_message>
<xml_diff>
--- a/templates/dist/bank-cur-report.docx
+++ b/templates/dist/bank-cur-report.docx
@@ -5,6 +5,7 @@
     <w:tbl>
       <w:tblPr>
         <w:tblpPr w:leftFromText="180" w:rightFromText="180" w:vertAnchor="text" w:horzAnchor="margin" w:tblpY="463"/>
+        <w:bidiVisual w:val="0"/>
         <w:tblW w:w="10774" w:type="dxa"/>
         <w:tblLayout w:type="fixed"/>
         <w:tblLook w:val="01E0" w:firstRow="1" w:lastRow="1" w:firstColumn="1" w:lastColumn="1" w:noHBand="0" w:noVBand="0"/>
@@ -1418,6 +1419,7 @@
     <w:tbl>
       <w:tblPr>
         <w:tblpPr w:leftFromText="180" w:rightFromText="180" w:vertAnchor="text" w:horzAnchor="margin" w:tblpY="219"/>
+        <w:bidiVisual w:val="0"/>
         <w:tblW w:w="10774" w:type="dxa"/>
         <w:tblLayout w:type="fixed"/>
         <w:tblLook w:val="01E0" w:firstRow="1" w:lastRow="1" w:firstColumn="1" w:lastColumn="1" w:noHBand="0" w:noVBand="0"/>
@@ -1795,6 +1797,7 @@
     <w:tbl>
       <w:tblPr>
         <w:tblpPr w:leftFromText="180" w:rightFromText="180" w:vertAnchor="text" w:horzAnchor="margin" w:tblpX="15" w:tblpY="219"/>
+        <w:bidiVisual w:val="0"/>
         <w:tblW w:w="10774" w:type="dxa"/>
         <w:tblLayout w:type="fixed"/>
         <w:tblLook w:val="01E0" w:firstRow="1" w:lastRow="1" w:firstColumn="1" w:lastColumn="1" w:noHBand="0" w:noVBand="0"/>
@@ -2063,6 +2066,7 @@
     <w:tbl>
       <w:tblPr>
         <w:tblpPr w:leftFromText="180" w:rightFromText="180" w:vertAnchor="text" w:horzAnchor="margin" w:tblpY="87"/>
+        <w:bidiVisual w:val="0"/>
         <w:tblW w:w="10794" w:type="dxa"/>
         <w:tblBorders>
           <w:top w:val="dotted" w:sz="4" w:space="0" w:color="244061"/>
@@ -2258,6 +2262,7 @@
     <w:tbl>
       <w:tblPr>
         <w:tblpPr w:leftFromText="180" w:rightFromText="180" w:vertAnchor="text" w:horzAnchor="margin" w:tblpY="649"/>
+        <w:bidiVisual w:val="0"/>
         <w:tblW w:w="10774" w:type="dxa"/>
         <w:tblLayout w:type="fixed"/>
         <w:tblLook w:val="01E0" w:firstRow="1" w:lastRow="1" w:firstColumn="1" w:lastColumn="1" w:noHBand="0" w:noVBand="0"/>
@@ -2405,6 +2410,7 @@
     <w:tbl>
       <w:tblPr>
         <w:tblpPr w:leftFromText="180" w:rightFromText="180" w:vertAnchor="text" w:horzAnchor="margin" w:tblpY="34"/>
+        <w:bidiVisual w:val="0"/>
         <w:tblW w:w="5000" w:type="pct"/>
         <w:tblBorders>
           <w:top w:val="single" w:sz="4" w:space="0" w:color="auto"/>
@@ -7328,6 +7334,7 @@
     <w:tbl>
       <w:tblPr>
         <w:tblpPr w:leftFromText="180" w:rightFromText="180" w:vertAnchor="text" w:horzAnchor="margin" w:tblpY="16"/>
+        <w:bidiVisual w:val="0"/>
         <w:tblW w:w="10666" w:type="dxa"/>
         <w:tblBorders>
           <w:top w:val="single" w:sz="4" w:space="0" w:color="auto"/>
@@ -12266,6 +12273,7 @@
     <w:tbl>
       <w:tblPr>
         <w:tblpPr w:leftFromText="180" w:rightFromText="180" w:vertAnchor="text" w:horzAnchor="margin" w:tblpY="16"/>
+        <w:bidiVisual w:val="0"/>
         <w:tblW w:w="10666" w:type="dxa"/>
         <w:tblBorders>
           <w:top w:val="single" w:sz="4" w:space="0" w:color="auto"/>

</xml_diff>